<commit_message>
chore: restore pre-reset history and replay later local changes
</commit_message>
<xml_diff>
--- a/webapp/assets/formulieren/eindrapportage-werkfit-maken.docx
+++ b/webapp/assets/formulieren/eindrapportage-werkfit-maken.docx
@@ -119,7 +119,7 @@
             </w:pPr>
             <w:r>
               <w:drawing>
-                <wp:inline distT="0" distB="0" distL="0" distR="0" wp14:anchorId="7F988574" wp14:editId="6863956A">
+                <wp:inline distT="0" distB="0" distL="0" distR="0" wp14:anchorId="7F988574" wp14:editId="2F05DF83">
                   <wp:extent cx="504825" cy="504825"/>
                   <wp:effectExtent l="0" t="0" r="0" b="0"/>
                   <wp:docPr id="3" name="Afbeelding 1" descr="Afbeelding met Graphics, logo, Lettertype, symbool&#10;&#10;Automatisch gegenereerde beschrijving"/>
@@ -270,6 +270,7 @@
           <w:tcPr>
             <w:tcW w:w="405" w:type="dxa"/>
             <w:gridSpan w:val="3"/>
+            <w:shd w:val="clear" w:color="auto" w:fill="auto"/>
           </w:tcPr>
           <w:p>
             <w:pPr>
@@ -281,6 +282,7 @@
           <w:tcPr>
             <w:tcW w:w="4985" w:type="dxa"/>
             <w:gridSpan w:val="9"/>
+            <w:shd w:val="clear" w:color="auto" w:fill="auto"/>
           </w:tcPr>
           <w:p>
             <w:pPr>
@@ -582,6 +584,7 @@
         <w:tc>
           <w:tcPr>
             <w:tcW w:w="142" w:type="dxa"/>
+            <w:shd w:val="clear" w:color="auto" w:fill="auto"/>
           </w:tcPr>
           <w:p>
             <w:pPr>
@@ -593,6 +596,7 @@
           <w:tcPr>
             <w:tcW w:w="4985" w:type="dxa"/>
             <w:gridSpan w:val="10"/>
+            <w:shd w:val="clear" w:color="auto" w:fill="auto"/>
           </w:tcPr>
           <w:p>
             <w:pPr>
@@ -833,6 +837,7 @@
         <w:tc>
           <w:tcPr>
             <w:tcW w:w="448" w:type="dxa"/>
+            <w:shd w:val="clear" w:color="auto" w:fill="auto"/>
           </w:tcPr>
           <w:p>
             <w:pPr>
@@ -1254,19 +1259,19 @@
               <w:fldChar w:fldCharType="separate"/>
             </w:r>
             <w:r>
-              <w:t>{{</w:t>
-            </w:r>
-            <w:r>
-              <w:t>1</w:t>
-            </w:r>
-            <w:r>
-              <w:t>_</w:t>
-            </w:r>
-            <w:r>
-              <w:t>1</w:t>
-            </w:r>
-            <w:r>
-              <w:t>}}</w:t>
+              <w:t> </w:t>
+            </w:r>
+            <w:r>
+              <w:t> </w:t>
+            </w:r>
+            <w:r>
+              <w:t> </w:t>
+            </w:r>
+            <w:r>
+              <w:t> </w:t>
+            </w:r>
+            <w:r>
+              <w:t> </w:t>
             </w:r>
             <w:r>
               <w:fldChar w:fldCharType="end"/>
@@ -1461,7 +1466,19 @@
               <w:fldChar w:fldCharType="separate"/>
             </w:r>
             <w:r>
-              <w:t>{{1_2}}</w:t>
+              <w:t> </w:t>
+            </w:r>
+            <w:r>
+              <w:t> </w:t>
+            </w:r>
+            <w:r>
+              <w:t> </w:t>
+            </w:r>
+            <w:r>
+              <w:t> </w:t>
+            </w:r>
+            <w:r>
+              <w:t> </w:t>
             </w:r>
             <w:r>
               <w:fldChar w:fldCharType="end"/>
@@ -1759,6 +1776,7 @@
           <w:tcPr>
             <w:tcW w:w="417" w:type="dxa"/>
             <w:gridSpan w:val="4"/>
+            <w:shd w:val="clear" w:color="auto" w:fill="auto"/>
           </w:tcPr>
           <w:p>
             <w:pPr>
@@ -1773,6 +1791,7 @@
           <w:tcPr>
             <w:tcW w:w="2856" w:type="dxa"/>
             <w:gridSpan w:val="5"/>
+            <w:shd w:val="clear" w:color="auto" w:fill="auto"/>
           </w:tcPr>
           <w:p>
             <w:pPr>
@@ -1830,7 +1849,19 @@
               <w:fldChar w:fldCharType="separate"/>
             </w:r>
             <w:r>
-              <w:t>{{2_1}}</w:t>
+              <w:t> </w:t>
+            </w:r>
+            <w:r>
+              <w:t> </w:t>
+            </w:r>
+            <w:r>
+              <w:t> </w:t>
+            </w:r>
+            <w:r>
+              <w:t> </w:t>
+            </w:r>
+            <w:r>
+              <w:t> </w:t>
             </w:r>
             <w:r>
               <w:fldChar w:fldCharType="end"/>
@@ -2185,13 +2216,19 @@
               <w:fldChar w:fldCharType="separate"/>
             </w:r>
             <w:r>
-              <w:t>{{</w:t>
-            </w:r>
-            <w:r>
-              <w:t>3</w:t>
-            </w:r>
-            <w:r>
-              <w:t>_1}}</w:t>
+              <w:t> </w:t>
+            </w:r>
+            <w:r>
+              <w:t> </w:t>
+            </w:r>
+            <w:r>
+              <w:t> </w:t>
+            </w:r>
+            <w:r>
+              <w:t> </w:t>
+            </w:r>
+            <w:r>
+              <w:t> </w:t>
             </w:r>
             <w:r>
               <w:fldChar w:fldCharType="end"/>
@@ -2385,19 +2422,39 @@
               <w:fldChar w:fldCharType="separate"/>
             </w:r>
             <w:r>
-              <w:t>{{</w:t>
-            </w:r>
-            <w:r>
-              <w:t>3</w:t>
-            </w:r>
-            <w:r>
-              <w:t>_</w:t>
-            </w:r>
-            <w:r>
-              <w:t>2</w:t>
-            </w:r>
-            <w:r>
-              <w:t>}}</w:t>
+              <w:rPr>
+                <w:sz w:val="18"/>
+                <w:szCs w:val="18"/>
+              </w:rPr>
+              <w:t> </w:t>
+            </w:r>
+            <w:r>
+              <w:rPr>
+                <w:sz w:val="18"/>
+                <w:szCs w:val="18"/>
+              </w:rPr>
+              <w:t> </w:t>
+            </w:r>
+            <w:r>
+              <w:rPr>
+                <w:sz w:val="18"/>
+                <w:szCs w:val="18"/>
+              </w:rPr>
+              <w:t> </w:t>
+            </w:r>
+            <w:r>
+              <w:rPr>
+                <w:sz w:val="18"/>
+                <w:szCs w:val="18"/>
+              </w:rPr>
+              <w:t> </w:t>
+            </w:r>
+            <w:r>
+              <w:rPr>
+                <w:sz w:val="18"/>
+                <w:szCs w:val="18"/>
+              </w:rPr>
+              <w:t> </w:t>
             </w:r>
             <w:r>
               <w:rPr>
@@ -2576,19 +2633,19 @@
               <w:fldChar w:fldCharType="separate"/>
             </w:r>
             <w:r>
-              <w:t>{{</w:t>
-            </w:r>
-            <w:r>
-              <w:t>3</w:t>
-            </w:r>
-            <w:r>
-              <w:t>_</w:t>
-            </w:r>
-            <w:r>
-              <w:t>3</w:t>
-            </w:r>
-            <w:r>
-              <w:t>}}</w:t>
+              <w:t> </w:t>
+            </w:r>
+            <w:r>
+              <w:t> </w:t>
+            </w:r>
+            <w:r>
+              <w:t> </w:t>
+            </w:r>
+            <w:r>
+              <w:t> </w:t>
+            </w:r>
+            <w:r>
+              <w:t> </w:t>
             </w:r>
             <w:r>
               <w:fldChar w:fldCharType="end"/>
@@ -2763,19 +2820,19 @@
               <w:fldChar w:fldCharType="separate"/>
             </w:r>
             <w:r>
-              <w:t>{{</w:t>
-            </w:r>
-            <w:r>
-              <w:t>3</w:t>
-            </w:r>
-            <w:r>
-              <w:t>_</w:t>
-            </w:r>
-            <w:r>
-              <w:t>4</w:t>
-            </w:r>
-            <w:r>
-              <w:t>}}</w:t>
+              <w:t> </w:t>
+            </w:r>
+            <w:r>
+              <w:t> </w:t>
+            </w:r>
+            <w:r>
+              <w:t> </w:t>
+            </w:r>
+            <w:r>
+              <w:t> </w:t>
+            </w:r>
+            <w:r>
+              <w:t> </w:t>
             </w:r>
             <w:r>
               <w:fldChar w:fldCharType="end"/>
@@ -2793,7 +2850,7 @@
           </w:tcPr>
           <w:p>
             <w:pPr>
-              <w:pStyle w:val="Header"/>
+              <w:pStyle w:val="Koptekst"/>
               <w:widowControl w:val="0"/>
               <w:tabs>
                 <w:tab w:val="clear" w:pos="4536"/>
@@ -2970,19 +3027,19 @@
               <w:fldChar w:fldCharType="separate"/>
             </w:r>
             <w:r>
-              <w:t>{{</w:t>
-            </w:r>
-            <w:r>
-              <w:t>3</w:t>
-            </w:r>
-            <w:r>
-              <w:t>_</w:t>
-            </w:r>
-            <w:r>
-              <w:t>5</w:t>
-            </w:r>
-            <w:r>
-              <w:t>}}</w:t>
+              <w:t> </w:t>
+            </w:r>
+            <w:r>
+              <w:t> </w:t>
+            </w:r>
+            <w:r>
+              <w:t> </w:t>
+            </w:r>
+            <w:r>
+              <w:t> </w:t>
+            </w:r>
+            <w:r>
+              <w:t> </w:t>
             </w:r>
             <w:r>
               <w:fldChar w:fldCharType="end"/>
@@ -3316,6 +3373,7 @@
             <w:tcBorders>
               <w:bottom w:val="single" w:sz="2" w:space="0" w:color="808080"/>
             </w:tcBorders>
+            <w:shd w:val="clear" w:color="auto" w:fill="auto"/>
           </w:tcPr>
           <w:p>
             <w:pPr>
@@ -3340,7 +3398,19 @@
               <w:fldChar w:fldCharType="separate"/>
             </w:r>
             <w:r>
-              <w:t>{{4_1}}</w:t>
+              <w:t> </w:t>
+            </w:r>
+            <w:r>
+              <w:t> </w:t>
+            </w:r>
+            <w:r>
+              <w:t> </w:t>
+            </w:r>
+            <w:r>
+              <w:t> </w:t>
+            </w:r>
+            <w:r>
+              <w:t> </w:t>
             </w:r>
             <w:r>
               <w:fldChar w:fldCharType="end"/>
@@ -4317,7 +4387,19 @@
               <w:fldChar w:fldCharType="separate"/>
             </w:r>
             <w:r>
-              <w:t>{{5_1}}</w:t>
+              <w:t> </w:t>
+            </w:r>
+            <w:r>
+              <w:t> </w:t>
+            </w:r>
+            <w:r>
+              <w:t> </w:t>
+            </w:r>
+            <w:r>
+              <w:t> </w:t>
+            </w:r>
+            <w:r>
+              <w:t> </w:t>
             </w:r>
             <w:r>
               <w:fldChar w:fldCharType="end"/>
@@ -4519,7 +4601,19 @@
               <w:fldChar w:fldCharType="separate"/>
             </w:r>
             <w:r>
-              <w:t>{{5_2}}</w:t>
+              <w:t> </w:t>
+            </w:r>
+            <w:r>
+              <w:t> </w:t>
+            </w:r>
+            <w:r>
+              <w:t> </w:t>
+            </w:r>
+            <w:r>
+              <w:t> </w:t>
+            </w:r>
+            <w:r>
+              <w:t> </w:t>
             </w:r>
             <w:r>
               <w:fldChar w:fldCharType="end"/>
@@ -5423,6 +5517,7 @@
           <w:tcPr>
             <w:tcW w:w="7097" w:type="dxa"/>
             <w:gridSpan w:val="12"/>
+            <w:shd w:val="clear" w:color="auto" w:fill="auto"/>
           </w:tcPr>
           <w:p>
             <w:pPr>
@@ -5447,7 +5542,19 @@
               <w:fldChar w:fldCharType="separate"/>
             </w:r>
             <w:r>
-              <w:t>{{6_1}}</w:t>
+              <w:t> </w:t>
+            </w:r>
+            <w:r>
+              <w:t> </w:t>
+            </w:r>
+            <w:r>
+              <w:t> </w:t>
+            </w:r>
+            <w:r>
+              <w:t> </w:t>
+            </w:r>
+            <w:r>
+              <w:t> </w:t>
             </w:r>
             <w:r>
               <w:fldChar w:fldCharType="end"/>
@@ -5619,6 +5726,7 @@
           <w:tcPr>
             <w:tcW w:w="7097" w:type="dxa"/>
             <w:gridSpan w:val="12"/>
+            <w:shd w:val="clear" w:color="auto" w:fill="auto"/>
           </w:tcPr>
           <w:p>
             <w:pPr>
@@ -5643,7 +5751,19 @@
               <w:fldChar w:fldCharType="separate"/>
             </w:r>
             <w:r>
-              <w:t>{{6_2}}</w:t>
+              <w:t> </w:t>
+            </w:r>
+            <w:r>
+              <w:t> </w:t>
+            </w:r>
+            <w:r>
+              <w:t> </w:t>
+            </w:r>
+            <w:r>
+              <w:t> </w:t>
+            </w:r>
+            <w:r>
+              <w:t> </w:t>
             </w:r>
             <w:r>
               <w:fldChar w:fldCharType="end"/>
@@ -5822,6 +5942,7 @@
           <w:tcPr>
             <w:tcW w:w="7097" w:type="dxa"/>
             <w:gridSpan w:val="12"/>
+            <w:shd w:val="clear" w:color="auto" w:fill="auto"/>
           </w:tcPr>
           <w:p>
             <w:pPr>
@@ -5846,7 +5967,19 @@
               <w:fldChar w:fldCharType="separate"/>
             </w:r>
             <w:r>
-              <w:t>{{6_3}}</w:t>
+              <w:t> </w:t>
+            </w:r>
+            <w:r>
+              <w:t> </w:t>
+            </w:r>
+            <w:r>
+              <w:t> </w:t>
+            </w:r>
+            <w:r>
+              <w:t> </w:t>
+            </w:r>
+            <w:r>
+              <w:t> </w:t>
             </w:r>
             <w:r>
               <w:fldChar w:fldCharType="end"/>
@@ -6637,7 +6770,19 @@
               <w:fldChar w:fldCharType="separate"/>
             </w:r>
             <w:r>
-              <w:t>{{7_3_1_re_integratieactiviteit}}</w:t>
+              <w:t> </w:t>
+            </w:r>
+            <w:r>
+              <w:t> </w:t>
+            </w:r>
+            <w:r>
+              <w:t> </w:t>
+            </w:r>
+            <w:r>
+              <w:t> </w:t>
+            </w:r>
+            <w:r>
+              <w:t> </w:t>
             </w:r>
             <w:r>
               <w:fldChar w:fldCharType="end"/>
@@ -6661,6 +6806,7 @@
           <w:tcPr>
             <w:tcW w:w="2629" w:type="dxa"/>
             <w:gridSpan w:val="4"/>
+            <w:shd w:val="clear" w:color="auto" w:fill="auto"/>
           </w:tcPr>
           <w:p>
             <w:pPr>
@@ -6685,7 +6831,19 @@
               <w:fldChar w:fldCharType="separate"/>
             </w:r>
             <w:r>
-              <w:t>{{7_3_1_aantal_begeleidingsuren}}</w:t>
+              <w:t> </w:t>
+            </w:r>
+            <w:r>
+              <w:t> </w:t>
+            </w:r>
+            <w:r>
+              <w:t> </w:t>
+            </w:r>
+            <w:r>
+              <w:t> </w:t>
+            </w:r>
+            <w:r>
+              <w:t> </w:t>
             </w:r>
             <w:r>
               <w:fldChar w:fldCharType="end"/>
@@ -6898,7 +7056,19 @@
               <w:fldChar w:fldCharType="separate"/>
             </w:r>
             <w:r>
-              <w:t>{{7_3_2_re_integratieactiviteit}}</w:t>
+              <w:t> </w:t>
+            </w:r>
+            <w:r>
+              <w:t> </w:t>
+            </w:r>
+            <w:r>
+              <w:t> </w:t>
+            </w:r>
+            <w:r>
+              <w:t> </w:t>
+            </w:r>
+            <w:r>
+              <w:t> </w:t>
             </w:r>
             <w:r>
               <w:fldChar w:fldCharType="end"/>
@@ -6922,6 +7092,7 @@
           <w:tcPr>
             <w:tcW w:w="2629" w:type="dxa"/>
             <w:gridSpan w:val="4"/>
+            <w:shd w:val="clear" w:color="auto" w:fill="auto"/>
           </w:tcPr>
           <w:p>
             <w:pPr>
@@ -6946,7 +7117,19 @@
               <w:fldChar w:fldCharType="separate"/>
             </w:r>
             <w:r>
-              <w:t>{{7_3_2_aantal_begeleidingsuren}}</w:t>
+              <w:t> </w:t>
+            </w:r>
+            <w:r>
+              <w:t> </w:t>
+            </w:r>
+            <w:r>
+              <w:t> </w:t>
+            </w:r>
+            <w:r>
+              <w:t> </w:t>
+            </w:r>
+            <w:r>
+              <w:t> </w:t>
             </w:r>
             <w:r>
               <w:fldChar w:fldCharType="end"/>
@@ -7159,7 +7342,19 @@
               <w:fldChar w:fldCharType="separate"/>
             </w:r>
             <w:r>
-              <w:t>{{7_3_3_re_integratieactiviteit}}</w:t>
+              <w:t> </w:t>
+            </w:r>
+            <w:r>
+              <w:t> </w:t>
+            </w:r>
+            <w:r>
+              <w:t> </w:t>
+            </w:r>
+            <w:r>
+              <w:t> </w:t>
+            </w:r>
+            <w:r>
+              <w:t> </w:t>
             </w:r>
             <w:r>
               <w:fldChar w:fldCharType="end"/>
@@ -7183,6 +7378,7 @@
           <w:tcPr>
             <w:tcW w:w="2629" w:type="dxa"/>
             <w:gridSpan w:val="4"/>
+            <w:shd w:val="clear" w:color="auto" w:fill="auto"/>
           </w:tcPr>
           <w:p>
             <w:pPr>
@@ -7207,7 +7403,19 @@
               <w:fldChar w:fldCharType="separate"/>
             </w:r>
             <w:r>
-              <w:t>{{7_3_3_aantal_begeleidingsuren}}</w:t>
+              <w:t> </w:t>
+            </w:r>
+            <w:r>
+              <w:t> </w:t>
+            </w:r>
+            <w:r>
+              <w:t> </w:t>
+            </w:r>
+            <w:r>
+              <w:t> </w:t>
+            </w:r>
+            <w:r>
+              <w:t> </w:t>
             </w:r>
             <w:r>
               <w:fldChar w:fldCharType="end"/>
@@ -7419,7 +7627,19 @@
               <w:fldChar w:fldCharType="separate"/>
             </w:r>
             <w:r>
-              <w:t>{{7_3_4_re_integratieactiviteit}}</w:t>
+              <w:t> </w:t>
+            </w:r>
+            <w:r>
+              <w:t> </w:t>
+            </w:r>
+            <w:r>
+              <w:t> </w:t>
+            </w:r>
+            <w:r>
+              <w:t> </w:t>
+            </w:r>
+            <w:r>
+              <w:t> </w:t>
             </w:r>
             <w:r>
               <w:fldChar w:fldCharType="end"/>
@@ -7443,6 +7663,7 @@
           <w:tcPr>
             <w:tcW w:w="2629" w:type="dxa"/>
             <w:gridSpan w:val="4"/>
+            <w:shd w:val="clear" w:color="auto" w:fill="auto"/>
           </w:tcPr>
           <w:p>
             <w:pPr>
@@ -7467,7 +7688,19 @@
               <w:fldChar w:fldCharType="separate"/>
             </w:r>
             <w:r>
-              <w:t>{{7_3_4_aantal_begeleidingsuren}}</w:t>
+              <w:t> </w:t>
+            </w:r>
+            <w:r>
+              <w:t> </w:t>
+            </w:r>
+            <w:r>
+              <w:t> </w:t>
+            </w:r>
+            <w:r>
+              <w:t> </w:t>
+            </w:r>
+            <w:r>
+              <w:t> </w:t>
             </w:r>
             <w:r>
               <w:fldChar w:fldCharType="end"/>
@@ -7679,7 +7912,19 @@
               <w:fldChar w:fldCharType="separate"/>
             </w:r>
             <w:r>
-              <w:t>{{7_3_5_re_integratieactiviteit}}</w:t>
+              <w:t> </w:t>
+            </w:r>
+            <w:r>
+              <w:t> </w:t>
+            </w:r>
+            <w:r>
+              <w:t> </w:t>
+            </w:r>
+            <w:r>
+              <w:t> </w:t>
+            </w:r>
+            <w:r>
+              <w:t> </w:t>
             </w:r>
             <w:r>
               <w:fldChar w:fldCharType="end"/>
@@ -7703,6 +7948,7 @@
           <w:tcPr>
             <w:tcW w:w="2629" w:type="dxa"/>
             <w:gridSpan w:val="4"/>
+            <w:shd w:val="clear" w:color="auto" w:fill="auto"/>
           </w:tcPr>
           <w:p>
             <w:pPr>
@@ -7727,7 +7973,19 @@
               <w:fldChar w:fldCharType="separate"/>
             </w:r>
             <w:r>
-              <w:t>{{7_3_5_aantal_begeleidingsuren}}</w:t>
+              <w:t> </w:t>
+            </w:r>
+            <w:r>
+              <w:t> </w:t>
+            </w:r>
+            <w:r>
+              <w:t> </w:t>
+            </w:r>
+            <w:r>
+              <w:t> </w:t>
+            </w:r>
+            <w:r>
+              <w:t> </w:t>
             </w:r>
             <w:r>
               <w:fldChar w:fldCharType="end"/>
@@ -7955,6 +8213,7 @@
             <w:tcBorders>
               <w:bottom w:val="single" w:sz="2" w:space="0" w:color="808080"/>
             </w:tcBorders>
+            <w:shd w:val="clear" w:color="auto" w:fill="auto"/>
           </w:tcPr>
           <w:p>
             <w:pPr>
@@ -7979,7 +8238,19 @@
               <w:fldChar w:fldCharType="separate"/>
             </w:r>
             <w:r>
-              <w:t>{{7_3_totaal_aantal_begeleidingsuren}}</w:t>
+              <w:t> </w:t>
+            </w:r>
+            <w:r>
+              <w:t> </w:t>
+            </w:r>
+            <w:r>
+              <w:t> </w:t>
+            </w:r>
+            <w:r>
+              <w:t> </w:t>
+            </w:r>
+            <w:r>
+              <w:t> </w:t>
             </w:r>
             <w:r>
               <w:fldChar w:fldCharType="end"/>
@@ -8564,7 +8835,19 @@
               <w:fldChar w:fldCharType="separate"/>
             </w:r>
             <w:r>
-              <w:t>{{7_1}}</w:t>
+              <w:t> </w:t>
+            </w:r>
+            <w:r>
+              <w:t> </w:t>
+            </w:r>
+            <w:r>
+              <w:t> </w:t>
+            </w:r>
+            <w:r>
+              <w:t> </w:t>
+            </w:r>
+            <w:r>
+              <w:t> </w:t>
             </w:r>
             <w:r>
               <w:fldChar w:fldCharType="end"/>
@@ -9038,6 +9321,7 @@
           <w:tcPr>
             <w:tcW w:w="7097" w:type="dxa"/>
             <w:gridSpan w:val="12"/>
+            <w:shd w:val="clear" w:color="auto" w:fill="auto"/>
           </w:tcPr>
           <w:p>
             <w:pPr>
@@ -9061,7 +9345,19 @@
               <w:fldChar w:fldCharType="separate"/>
             </w:r>
             <w:r>
-              <w:t>{{7_4}}</w:t>
+              <w:t> </w:t>
+            </w:r>
+            <w:r>
+              <w:t> </w:t>
+            </w:r>
+            <w:r>
+              <w:t> </w:t>
+            </w:r>
+            <w:r>
+              <w:t> </w:t>
+            </w:r>
+            <w:r>
+              <w:t> </w:t>
             </w:r>
             <w:r>
               <w:fldChar w:fldCharType="end"/>
@@ -9250,6 +9546,7 @@
           <w:tcPr>
             <w:tcW w:w="7097" w:type="dxa"/>
             <w:gridSpan w:val="12"/>
+            <w:shd w:val="clear" w:color="auto" w:fill="auto"/>
           </w:tcPr>
           <w:p>
             <w:pPr>
@@ -9273,7 +9570,19 @@
               <w:fldChar w:fldCharType="separate"/>
             </w:r>
             <w:r>
-              <w:t>{{7_5}}</w:t>
+              <w:t> </w:t>
+            </w:r>
+            <w:r>
+              <w:t> </w:t>
+            </w:r>
+            <w:r>
+              <w:t> </w:t>
+            </w:r>
+            <w:r>
+              <w:t> </w:t>
+            </w:r>
+            <w:r>
+              <w:t> </w:t>
             </w:r>
             <w:r>
               <w:fldChar w:fldCharType="end"/>
@@ -10108,6 +10417,7 @@
           <w:tcPr>
             <w:tcW w:w="7097" w:type="dxa"/>
             <w:gridSpan w:val="3"/>
+            <w:shd w:val="clear" w:color="auto" w:fill="auto"/>
           </w:tcPr>
           <w:p>
             <w:pPr>
@@ -10132,7 +10442,19 @@
               <w:fldChar w:fldCharType="separate"/>
             </w:r>
             <w:r>
-              <w:t>{{7_6}}</w:t>
+              <w:t> </w:t>
+            </w:r>
+            <w:r>
+              <w:t> </w:t>
+            </w:r>
+            <w:r>
+              <w:t> </w:t>
+            </w:r>
+            <w:r>
+              <w:t> </w:t>
+            </w:r>
+            <w:r>
+              <w:t> </w:t>
             </w:r>
             <w:r>
               <w:fldChar w:fldCharType="end"/>
@@ -10295,6 +10617,7 @@
           <w:tcPr>
             <w:tcW w:w="7097" w:type="dxa"/>
             <w:gridSpan w:val="3"/>
+            <w:shd w:val="clear" w:color="auto" w:fill="auto"/>
           </w:tcPr>
           <w:p>
             <w:pPr>
@@ -10319,7 +10642,19 @@
               <w:fldChar w:fldCharType="separate"/>
             </w:r>
             <w:r>
-              <w:t>{{7_7}}</w:t>
+              <w:t> </w:t>
+            </w:r>
+            <w:r>
+              <w:t> </w:t>
+            </w:r>
+            <w:r>
+              <w:t> </w:t>
+            </w:r>
+            <w:r>
+              <w:t> </w:t>
+            </w:r>
+            <w:r>
+              <w:t> </w:t>
             </w:r>
             <w:r>
               <w:fldChar w:fldCharType="end"/>
@@ -10490,6 +10825,7 @@
           <w:tcPr>
             <w:tcW w:w="7097" w:type="dxa"/>
             <w:gridSpan w:val="3"/>
+            <w:shd w:val="clear" w:color="auto" w:fill="auto"/>
           </w:tcPr>
           <w:p>
             <w:pPr>
@@ -10514,7 +10850,19 @@
               <w:fldChar w:fldCharType="separate"/>
             </w:r>
             <w:r>
-              <w:t>{{7_8}}</w:t>
+              <w:t> </w:t>
+            </w:r>
+            <w:r>
+              <w:t> </w:t>
+            </w:r>
+            <w:r>
+              <w:t> </w:t>
+            </w:r>
+            <w:r>
+              <w:t> </w:t>
+            </w:r>
+            <w:r>
+              <w:t> </w:t>
             </w:r>
             <w:r>
               <w:fldChar w:fldCharType="end"/>
@@ -10922,7 +11270,19 @@
               <w:fldChar w:fldCharType="separate"/>
             </w:r>
             <w:r>
-              <w:t>{{8_1}}</w:t>
+              <w:t> </w:t>
+            </w:r>
+            <w:r>
+              <w:t> </w:t>
+            </w:r>
+            <w:r>
+              <w:t> </w:t>
+            </w:r>
+            <w:r>
+              <w:t> </w:t>
+            </w:r>
+            <w:r>
+              <w:t> </w:t>
             </w:r>
             <w:r>
               <w:fldChar w:fldCharType="end"/>
@@ -11232,9 +11592,6 @@
               <w:fldChar w:fldCharType="separate"/>
             </w:r>
             <w:r>
-              <w:t>{{8_2_toelichting}}</w:t>
-            </w:r>
-            <w:r>
               <w:fldChar w:fldCharType="end"/>
             </w:r>
             <w:r>
@@ -11263,6 +11620,7 @@
         <w:tc>
           <w:tcPr>
             <w:tcW w:w="5520" w:type="dxa"/>
+            <w:shd w:val="clear" w:color="auto" w:fill="auto"/>
           </w:tcPr>
           <w:p>
             <w:pPr>
@@ -11808,7 +12166,19 @@
               <w:fldChar w:fldCharType="separate"/>
             </w:r>
             <w:r>
-              <w:t>{{10_a}}</w:t>
+              <w:t> </w:t>
+            </w:r>
+            <w:r>
+              <w:t> </w:t>
+            </w:r>
+            <w:r>
+              <w:t> </w:t>
+            </w:r>
+            <w:r>
+              <w:t> </w:t>
+            </w:r>
+            <w:r>
+              <w:t> </w:t>
             </w:r>
             <w:r>
               <w:fldChar w:fldCharType="end"/>
@@ -11818,6 +12188,9 @@
             </w:r>
             <w:r>
               <w:instrText xml:space="preserve"> FORMTEXT </w:instrText>
+            </w:r>
+            <w:r>
+              <w:fldChar w:fldCharType="separate"/>
             </w:r>
             <w:r>
               <w:fldChar w:fldCharType="end"/>
@@ -12246,7 +12619,19 @@
               <w:fldChar w:fldCharType="separate"/>
             </w:r>
             <w:r>
-              <w:t>{{10_c}}</w:t>
+              <w:t> </w:t>
+            </w:r>
+            <w:r>
+              <w:t> </w:t>
+            </w:r>
+            <w:r>
+              <w:t> </w:t>
+            </w:r>
+            <w:r>
+              <w:t> </w:t>
+            </w:r>
+            <w:r>
+              <w:t> </w:t>
             </w:r>
             <w:r>
               <w:fldChar w:fldCharType="end"/>
@@ -12645,7 +13030,19 @@
               <w:fldChar w:fldCharType="separate"/>
             </w:r>
             <w:r>
-              <w:t>{{10_d}}</w:t>
+              <w:t> </w:t>
+            </w:r>
+            <w:r>
+              <w:t> </w:t>
+            </w:r>
+            <w:r>
+              <w:t> </w:t>
+            </w:r>
+            <w:r>
+              <w:t> </w:t>
+            </w:r>
+            <w:r>
+              <w:t> </w:t>
             </w:r>
             <w:r>
               <w:fldChar w:fldCharType="end"/>
@@ -12655,6 +13052,9 @@
             </w:r>
             <w:r>
               <w:instrText xml:space="preserve"> FORMTEXT </w:instrText>
+            </w:r>
+            <w:r>
+              <w:fldChar w:fldCharType="separate"/>
             </w:r>
             <w:r>
               <w:fldChar w:fldCharType="end"/>
@@ -13081,7 +13481,19 @@
               <w:fldChar w:fldCharType="separate"/>
             </w:r>
             <w:r>
-              <w:t>{{10_f}}</w:t>
+              <w:t> </w:t>
+            </w:r>
+            <w:r>
+              <w:t> </w:t>
+            </w:r>
+            <w:r>
+              <w:t> </w:t>
+            </w:r>
+            <w:r>
+              <w:t> </w:t>
+            </w:r>
+            <w:r>
+              <w:t> </w:t>
             </w:r>
             <w:r>
               <w:fldChar w:fldCharType="end"/>
@@ -13477,7 +13889,7 @@
         </w:tcPr>
         <w:p>
           <w:pPr>
-            <w:pStyle w:val="Footer"/>
+            <w:pStyle w:val="Voettekst"/>
             <w:rPr>
               <w:b w:val="0"/>
             </w:rPr>
@@ -13496,7 +13908,7 @@
         </w:tcPr>
         <w:p>
           <w:pPr>
-            <w:pStyle w:val="Footer"/>
+            <w:pStyle w:val="Voettekst"/>
             <w:rPr>
               <w:b w:val="0"/>
             </w:rPr>
@@ -13516,7 +13928,7 @@
         </w:tcPr>
         <w:p>
           <w:pPr>
-            <w:pStyle w:val="Footer"/>
+            <w:pStyle w:val="Voettekst"/>
             <w:rPr>
               <w:b w:val="0"/>
             </w:rPr>
@@ -13567,7 +13979,7 @@
   </w:tbl>
   <w:p>
     <w:pPr>
-      <w:pStyle w:val="Footer"/>
+      <w:pStyle w:val="Voettekst"/>
     </w:pPr>
   </w:p>
 </w:ftr>
@@ -13799,7 +14211,7 @@
         </w:tcPr>
         <w:p>
           <w:pPr>
-            <w:pStyle w:val="Footer"/>
+            <w:pStyle w:val="Voettekst"/>
             <w:rPr>
               <w:b w:val="0"/>
             </w:rPr>
@@ -13818,7 +14230,7 @@
         </w:tcPr>
         <w:p>
           <w:pPr>
-            <w:pStyle w:val="Footer"/>
+            <w:pStyle w:val="Voettekst"/>
             <w:rPr>
               <w:b w:val="0"/>
             </w:rPr>
@@ -13838,7 +14250,7 @@
         </w:tcPr>
         <w:p>
           <w:pPr>
-            <w:pStyle w:val="Footer"/>
+            <w:pStyle w:val="Voettekst"/>
             <w:rPr>
               <w:b w:val="0"/>
             </w:rPr>
@@ -13889,7 +14301,7 @@
   </w:tbl>
   <w:p>
     <w:pPr>
-      <w:pStyle w:val="Footer"/>
+      <w:pStyle w:val="Voettekst"/>
     </w:pPr>
   </w:p>
 </w:ftr>
@@ -13924,7 +14336,7 @@
 <w:hdr xmlns:wpc="http://schemas.microsoft.com/office/word/2010/wordprocessingCanvas" xmlns:cx="http://schemas.microsoft.com/office/drawing/2014/chartex" xmlns:cx1="http://schemas.microsoft.com/office/drawing/2015/9/8/chartex" xmlns:cx2="http://schemas.microsoft.com/office/drawing/2015/10/21/chartex" xmlns:cx3="http://schemas.microsoft.com/office/drawing/2016/5/9/chartex" xmlns:cx4="http://schemas.microsoft.com/office/drawing/2016/5/10/chartex" xmlns:cx5="http://schemas.microsoft.com/office/drawing/2016/5/11/chartex" xmlns:cx6="http://schemas.microsoft.com/office/drawing/2016/5/12/chartex" xmlns:cx7="http://schemas.microsoft.com/office/drawing/2016/5/13/chartex" xmlns:cx8="http://schemas.microsoft.com/office/drawing/2016/5/14/chartex" xmlns:mc="http://schemas.openxmlformats.org/markup-compatibility/2006" xmlns:aink="http://schemas.microsoft.com/office/drawing/2016/ink" xmlns:am3d="http://schemas.microsoft.com/office/drawing/2017/model3d" xmlns:o="urn:schemas-microsoft-com:office:office" xmlns:oel="http://schemas.microsoft.com/office/2019/extlst" xmlns:r="http://schemas.openxmlformats.org/officeDocument/2006/relationships" xmlns:m="http://schemas.openxmlformats.org/officeDocument/2006/math" xmlns:v="urn:schemas-microsoft-com:vml" xmlns:wp14="http://schemas.microsoft.com/office/word/2010/wordprocessingDrawing" xmlns:wp="http://schemas.openxmlformats.org/drawingml/2006/wordprocessingDrawing" xmlns:w10="urn:schemas-microsoft-com:office:word" xmlns:w="http://schemas.openxmlformats.org/wordprocessingml/2006/main" xmlns:w14="http://schemas.microsoft.com/office/word/2010/wordml" xmlns:w15="http://schemas.microsoft.com/office/word/2012/wordml" xmlns:w16cex="http://schemas.microsoft.com/office/word/2018/wordml/cex" xmlns:w16cid="http://schemas.microsoft.com/office/word/2016/wordml/cid" xmlns:w16="http://schemas.microsoft.com/office/word/2018/wordml" xmlns:w16du="http://schemas.microsoft.com/office/word/2023/wordml/word16du" xmlns:w16sdtdh="http://schemas.microsoft.com/office/word/2020/wordml/sdtdatahash" xmlns:w16sdtfl="http://schemas.microsoft.com/office/word/2024/wordml/sdtformatlock" xmlns:w16se="http://schemas.microsoft.com/office/word/2015/wordml/symex" xmlns:wpg="http://schemas.microsoft.com/office/word/2010/wordprocessingGroup" xmlns:wpi="http://schemas.microsoft.com/office/word/2010/wordprocessingInk" xmlns:wne="http://schemas.microsoft.com/office/word/2006/wordml" xmlns:wps="http://schemas.microsoft.com/office/word/2010/wordprocessingShape" mc:Ignorable="w14 w15 w16se w16cid w16 w16cex w16sdtdh w16sdtfl w16du wp14">
   <w:p>
     <w:pPr>
-      <w:pStyle w:val="Header"/>
+      <w:pStyle w:val="Koptekst"/>
     </w:pPr>
     <w:r>
       <w:t xml:space="preserve"> </w:t>
@@ -16342,7 +16754,7 @@
     <w:lsdException w:name="Unresolved Mention" w:semiHidden="1" w:unhideWhenUsed="1"/>
     <w:lsdException w:name="Smart Link" w:semiHidden="1" w:unhideWhenUsed="1"/>
   </w:latentStyles>
-  <w:style w:type="paragraph" w:default="1" w:styleId="Normal">
+  <w:style w:type="paragraph" w:default="1" w:styleId="Standaard">
     <w:name w:val="Normal"/>
     <w:qFormat/>
     <w:rsid w:val="009C5D98"/>
@@ -16354,10 +16766,10 @@
       <w:sz w:val="16"/>
     </w:rPr>
   </w:style>
-  <w:style w:type="paragraph" w:styleId="Heading1">
+  <w:style w:type="paragraph" w:styleId="Kop1">
     <w:name w:val="heading 1"/>
-    <w:basedOn w:val="Normal"/>
-    <w:next w:val="Normal"/>
+    <w:basedOn w:val="Standaard"/>
+    <w:next w:val="Standaard"/>
     <w:qFormat/>
     <w:rsid w:val="000424B9"/>
     <w:pPr>
@@ -16374,13 +16786,13 @@
       <w:szCs w:val="32"/>
     </w:rPr>
   </w:style>
-  <w:style w:type="character" w:default="1" w:styleId="DefaultParagraphFont">
+  <w:style w:type="character" w:default="1" w:styleId="Standaardalinea-lettertype">
     <w:name w:val="Default Paragraph Font"/>
     <w:uiPriority w:val="1"/>
     <w:semiHidden/>
     <w:unhideWhenUsed/>
   </w:style>
-  <w:style w:type="table" w:default="1" w:styleId="TableNormal">
+  <w:style w:type="table" w:default="1" w:styleId="Standaardtabel">
     <w:name w:val="Normal Table"/>
     <w:uiPriority w:val="99"/>
     <w:semiHidden/>
@@ -16395,15 +16807,15 @@
       </w:tblCellMar>
     </w:tblPr>
   </w:style>
-  <w:style w:type="numbering" w:default="1" w:styleId="NoList">
+  <w:style w:type="numbering" w:default="1" w:styleId="Geenlijst">
     <w:name w:val="No List"/>
     <w:uiPriority w:val="99"/>
     <w:semiHidden/>
     <w:unhideWhenUsed/>
   </w:style>
-  <w:style w:type="paragraph" w:styleId="Header">
+  <w:style w:type="paragraph" w:styleId="Koptekst">
     <w:name w:val="header"/>
-    <w:basedOn w:val="Normal"/>
+    <w:basedOn w:val="Standaard"/>
     <w:pPr>
       <w:tabs>
         <w:tab w:val="center" w:pos="4536"/>
@@ -16523,15 +16935,15 @@
   </w:style>
   <w:style w:type="paragraph" w:customStyle="1" w:styleId="Datumenhandtekening">
     <w:name w:val="Datum en handtekening"/>
-    <w:basedOn w:val="Normal"/>
+    <w:basedOn w:val="Standaard"/>
     <w:pPr>
       <w:spacing w:before="440"/>
     </w:pPr>
   </w:style>
-  <w:style w:type="paragraph" w:styleId="Footer">
+  <w:style w:type="paragraph" w:styleId="Voettekst">
     <w:name w:val="footer"/>
     <w:basedOn w:val="Rubriekskop"/>
-    <w:link w:val="FooterChar"/>
+    <w:link w:val="VoettekstChar"/>
     <w:uiPriority w:val="99"/>
     <w:pPr>
       <w:tabs>
@@ -16544,9 +16956,9 @@
       <w:color w:val="auto"/>
     </w:rPr>
   </w:style>
-  <w:style w:type="character" w:styleId="PageNumber">
+  <w:style w:type="character" w:styleId="Paginanummer">
     <w:name w:val="page number"/>
-    <w:basedOn w:val="DefaultParagraphFont"/>
+    <w:basedOn w:val="Standaardalinea-lettertype"/>
   </w:style>
   <w:style w:type="paragraph" w:customStyle="1" w:styleId="Boventekst">
     <w:name w:val="Boventekst"/>
@@ -16574,15 +16986,15 @@
   </w:style>
   <w:style w:type="paragraph" w:customStyle="1" w:styleId="Toelichting">
     <w:name w:val="Toelichting"/>
-    <w:basedOn w:val="Normal"/>
+    <w:basedOn w:val="Standaard"/>
     <w:rsid w:val="00E8791E"/>
     <w:pPr>
       <w:spacing w:before="0"/>
     </w:pPr>
   </w:style>
-  <w:style w:type="paragraph" w:styleId="BalloonText">
+  <w:style w:type="paragraph" w:styleId="Ballontekst">
     <w:name w:val="Balloon Text"/>
-    <w:basedOn w:val="Normal"/>
+    <w:basedOn w:val="Standaard"/>
     <w:semiHidden/>
     <w:rsid w:val="005453FF"/>
     <w:rPr>
@@ -16645,16 +17057,16 @@
       <w:u w:val="single"/>
     </w:rPr>
   </w:style>
-  <w:style w:type="paragraph" w:styleId="CommentText">
+  <w:style w:type="paragraph" w:styleId="Tekstopmerking">
     <w:name w:val="annotation text"/>
-    <w:basedOn w:val="Normal"/>
-    <w:link w:val="CommentTextChar"/>
+    <w:basedOn w:val="Standaard"/>
+    <w:link w:val="TekstopmerkingChar"/>
     <w:semiHidden/>
     <w:rsid w:val="00E154F1"/>
   </w:style>
-  <w:style w:type="character" w:customStyle="1" w:styleId="CommentTextChar">
-    <w:name w:val="Comment Text Char"/>
-    <w:link w:val="CommentText"/>
+  <w:style w:type="character" w:customStyle="1" w:styleId="TekstopmerkingChar">
+    <w:name w:val="Tekst opmerking Char"/>
+    <w:link w:val="Tekstopmerking"/>
     <w:semiHidden/>
     <w:rsid w:val="00E154F1"/>
     <w:rPr>
@@ -16663,11 +17075,11 @@
       <w:lang w:val="nl-NL" w:eastAsia="nl-NL" w:bidi="ar-SA"/>
     </w:rPr>
   </w:style>
-  <w:style w:type="paragraph" w:styleId="CommentSubject">
+  <w:style w:type="paragraph" w:styleId="Onderwerpvanopmerking">
     <w:name w:val="annotation subject"/>
-    <w:basedOn w:val="CommentText"/>
-    <w:next w:val="CommentText"/>
-    <w:link w:val="CommentSubjectChar"/>
+    <w:basedOn w:val="Tekstopmerking"/>
+    <w:next w:val="Tekstopmerking"/>
+    <w:link w:val="OnderwerpvanopmerkingChar"/>
     <w:semiHidden/>
     <w:rsid w:val="00E154F1"/>
     <w:rPr>
@@ -16675,9 +17087,9 @@
       <w:bCs/>
     </w:rPr>
   </w:style>
-  <w:style w:type="character" w:customStyle="1" w:styleId="CommentSubjectChar">
-    <w:name w:val="Comment Subject Char"/>
-    <w:link w:val="CommentSubject"/>
+  <w:style w:type="character" w:customStyle="1" w:styleId="OnderwerpvanopmerkingChar">
+    <w:name w:val="Onderwerp van opmerking Char"/>
+    <w:link w:val="Onderwerpvanopmerking"/>
     <w:semiHidden/>
     <w:rsid w:val="00E154F1"/>
     <w:rPr>
@@ -16688,7 +17100,7 @@
       <w:lang w:val="nl-NL" w:eastAsia="nl-NL" w:bidi="ar-SA"/>
     </w:rPr>
   </w:style>
-  <w:style w:type="character" w:styleId="CommentReference">
+  <w:style w:type="character" w:styleId="Verwijzingopmerking">
     <w:name w:val="annotation reference"/>
     <w:uiPriority w:val="99"/>
     <w:semiHidden/>
@@ -16699,9 +17111,9 @@
       <w:szCs w:val="16"/>
     </w:rPr>
   </w:style>
-  <w:style w:type="character" w:customStyle="1" w:styleId="FooterChar">
-    <w:name w:val="Footer Char"/>
-    <w:link w:val="Footer"/>
+  <w:style w:type="character" w:customStyle="1" w:styleId="VoettekstChar">
+    <w:name w:val="Voettekst Char"/>
+    <w:link w:val="Voettekst"/>
     <w:uiPriority w:val="99"/>
     <w:rsid w:val="0052624F"/>
     <w:rPr>
@@ -16731,7 +17143,7 @@
   </w:style>
   <w:style w:type="paragraph" w:customStyle="1" w:styleId="Basistekst">
     <w:name w:val="Basistekst"/>
-    <w:basedOn w:val="Normal"/>
+    <w:basedOn w:val="Standaard"/>
     <w:link w:val="BasistekstChar"/>
     <w:rsid w:val="00A84D04"/>
   </w:style>
@@ -16746,7 +17158,7 @@
   </w:style>
   <w:style w:type="paragraph" w:customStyle="1" w:styleId="barcode">
     <w:name w:val="barcode"/>
-    <w:basedOn w:val="Normal"/>
+    <w:basedOn w:val="Standaard"/>
     <w:rsid w:val="00086327"/>
     <w:pPr>
       <w:spacing w:before="160" w:line="500" w:lineRule="exact"/>
@@ -17071,6 +17483,21 @@
 </file>
 
 <file path=customXml/item1.xml><?xml version="1.0" encoding="utf-8"?>
+<?mso-contentType ?>
+<SharedContentType xmlns="Microsoft.SharePoint.Taxonomy.ContentTypeSync" SourceId="ecadf510-6fd9-4589-915b-e40c5db06ce5" ContentTypeId="0x01" PreviousValue="false"/>
+</file>
+
+<file path=customXml/item2.xml><?xml version="1.0" encoding="utf-8"?>
+<?mso-contentType ?>
+<customXsn xmlns="http://schemas.microsoft.com/office/2006/metadata/customXsn">
+  <xsnLocation/>
+  <cached>True</cached>
+  <openByDefault>True</openByDefault>
+  <xsnScope/>
+</customXsn>
+</file>
+
+<file path=customXml/item3.xml><?xml version="1.0" encoding="utf-8"?>
 <ct:contentTypeSchema xmlns:ct="http://schemas.microsoft.com/office/2006/metadata/contentType" xmlns:ma="http://schemas.microsoft.com/office/2006/metadata/properties/metaAttributes" ct:_="" ma:_="" ma:contentTypeName="Document" ma:contentTypeID="0x0101003A6D5408B586F64EA93D10C8B68B54AB" ma:contentTypeVersion="42" ma:contentTypeDescription="Een nieuw document maken." ma:contentTypeScope="" ma:versionID="cfdfabc2646042bcc3b7765006ad53cd">
   <xsd:schema xmlns:xsd="http://www.w3.org/2001/XMLSchema" xmlns:xs="http://www.w3.org/2001/XMLSchema" xmlns:p="http://schemas.microsoft.com/office/2006/metadata/properties" xmlns:ns2="14747966-98e6-4d6f-a6de-ce33cf7afe51" xmlns:ns3="54766f4f-78c7-475e-8858-12d6d8f661b5" targetNamespace="http://schemas.microsoft.com/office/2006/metadata/properties" ma:root="true" ma:fieldsID="f1edde8a415dca4554e36a79dfec5a84" ns2:_="" ns3:_="">
     <xsd:import namespace="14747966-98e6-4d6f-a6de-ce33cf7afe51"/>
@@ -17602,23 +18029,9 @@
 </ct:contentTypeSchema>
 </file>
 
-<file path=customXml/item2.xml><?xml version="1.0" encoding="utf-8"?>
+<file path=customXml/item4.xml><?xml version="1.0" encoding="utf-8"?>
 <?mso-contentType ?>
-<customXsn xmlns="http://schemas.microsoft.com/office/2006/metadata/customXsn">
-  <xsnLocation/>
-  <cached>True</cached>
-  <openByDefault>True</openByDefault>
-  <xsnScope/>
-</customXsn>
-</file>
-
-<file path=customXml/item3.xml><?xml version="1.0" encoding="utf-8"?>
-<?mso-contentType ?>
-<SharedContentType xmlns="Microsoft.SharePoint.Taxonomy.ContentTypeSync" SourceId="ecadf510-6fd9-4589-915b-e40c5db06ce5" ContentTypeId="0x01" PreviousValue="false"/>
-</file>
-
-<file path=customXml/item4.xml><?xml version="1.0" encoding="utf-8"?>
-<LongProperties xmlns="http://schemas.microsoft.com/office/2006/metadata/longProperties"/>
+<FormTemplates xmlns="http://schemas.microsoft.com/sharepoint/v3/contenttype/forms"/>
 </file>
 
 <file path=customXml/item5.xml><?xml version="1.0" encoding="utf-8"?>
@@ -17649,11 +18062,26 @@
 </file>
 
 <file path=customXml/item6.xml><?xml version="1.0" encoding="utf-8"?>
-<?mso-contentType ?>
-<FormTemplates xmlns="http://schemas.microsoft.com/sharepoint/v3/contenttype/forms"/>
+<LongProperties xmlns="http://schemas.microsoft.com/office/2006/metadata/longProperties"/>
 </file>
 
 <file path=customXml/itemProps1.xml><?xml version="1.0" encoding="utf-8"?>
+<ds:datastoreItem xmlns:ds="http://schemas.openxmlformats.org/officeDocument/2006/customXml" ds:itemID="{2D5CBCA3-E536-46B6-A545-E29685787F21}">
+  <ds:schemaRefs>
+    <ds:schemaRef ds:uri="Microsoft.SharePoint.Taxonomy.ContentTypeSync"/>
+  </ds:schemaRefs>
+</ds:datastoreItem>
+</file>
+
+<file path=customXml/itemProps2.xml><?xml version="1.0" encoding="utf-8"?>
+<ds:datastoreItem xmlns:ds="http://schemas.openxmlformats.org/officeDocument/2006/customXml" ds:itemID="{986B7462-9760-40A1-94C2-91D8C5F582A1}">
+  <ds:schemaRefs>
+    <ds:schemaRef ds:uri="http://schemas.microsoft.com/office/2006/metadata/customXsn"/>
+  </ds:schemaRefs>
+</ds:datastoreItem>
+</file>
+
+<file path=customXml/itemProps3.xml><?xml version="1.0" encoding="utf-8"?>
 <ds:datastoreItem xmlns:ds="http://schemas.openxmlformats.org/officeDocument/2006/customXml" ds:itemID="{C6D83B8A-2A3E-4567-BCC4-6839AFB2D08B}">
   <ds:schemaRefs>
     <ds:schemaRef ds:uri="http://schemas.microsoft.com/office/2006/metadata/contentType"/>
@@ -17672,26 +18100,10 @@
 </ds:datastoreItem>
 </file>
 
-<file path=customXml/itemProps2.xml><?xml version="1.0" encoding="utf-8"?>
-<ds:datastoreItem xmlns:ds="http://schemas.openxmlformats.org/officeDocument/2006/customXml" ds:itemID="{986B7462-9760-40A1-94C2-91D8C5F582A1}">
+<file path=customXml/itemProps4.xml><?xml version="1.0" encoding="utf-8"?>
+<ds:datastoreItem xmlns:ds="http://schemas.openxmlformats.org/officeDocument/2006/customXml" ds:itemID="{44A4F72D-80E0-4364-836B-6B0C1A447B17}">
   <ds:schemaRefs>
-    <ds:schemaRef ds:uri="http://schemas.microsoft.com/office/2006/metadata/customXsn"/>
-  </ds:schemaRefs>
-</ds:datastoreItem>
-</file>
-
-<file path=customXml/itemProps3.xml><?xml version="1.0" encoding="utf-8"?>
-<ds:datastoreItem xmlns:ds="http://schemas.openxmlformats.org/officeDocument/2006/customXml" ds:itemID="{2D5CBCA3-E536-46B6-A545-E29685787F21}">
-  <ds:schemaRefs>
-    <ds:schemaRef ds:uri="Microsoft.SharePoint.Taxonomy.ContentTypeSync"/>
-  </ds:schemaRefs>
-</ds:datastoreItem>
-</file>
-
-<file path=customXml/itemProps4.xml><?xml version="1.0" encoding="utf-8"?>
-<ds:datastoreItem xmlns:ds="http://schemas.openxmlformats.org/officeDocument/2006/customXml" ds:itemID="{17378D8E-43B3-40A1-A419-0B64802CB110}">
-  <ds:schemaRefs>
-    <ds:schemaRef ds:uri="http://schemas.microsoft.com/office/2006/metadata/longProperties"/>
+    <ds:schemaRef ds:uri="http://schemas.microsoft.com/sharepoint/v3/contenttype/forms"/>
   </ds:schemaRefs>
 </ds:datastoreItem>
 </file>
@@ -17699,18 +18111,24 @@
 <file path=customXml/itemProps5.xml><?xml version="1.0" encoding="utf-8"?>
 <ds:datastoreItem xmlns:ds="http://schemas.openxmlformats.org/officeDocument/2006/customXml" ds:itemID="{53B53578-172D-44E3-9F2D-19DB866B7AC2}">
   <ds:schemaRefs>
+    <ds:schemaRef ds:uri="http://schemas.microsoft.com/office/2006/documentManagement/types"/>
+    <ds:schemaRef ds:uri="http://schemas.openxmlformats.org/package/2006/metadata/core-properties"/>
+    <ds:schemaRef ds:uri="http://purl.org/dc/terms/"/>
+    <ds:schemaRef ds:uri="http://www.w3.org/XML/1998/namespace"/>
+    <ds:schemaRef ds:uri="http://purl.org/dc/elements/1.1/"/>
     <ds:schemaRef ds:uri="http://schemas.microsoft.com/office/2006/metadata/properties"/>
+    <ds:schemaRef ds:uri="http://purl.org/dc/dcmitype/"/>
     <ds:schemaRef ds:uri="http://schemas.microsoft.com/office/infopath/2007/PartnerControls"/>
+    <ds:schemaRef ds:uri="54766f4f-78c7-475e-8858-12d6d8f661b5"/>
     <ds:schemaRef ds:uri="14747966-98e6-4d6f-a6de-ce33cf7afe51"/>
-    <ds:schemaRef ds:uri="54766f4f-78c7-475e-8858-12d6d8f661b5"/>
   </ds:schemaRefs>
 </ds:datastoreItem>
 </file>
 
 <file path=customXml/itemProps6.xml><?xml version="1.0" encoding="utf-8"?>
-<ds:datastoreItem xmlns:ds="http://schemas.openxmlformats.org/officeDocument/2006/customXml" ds:itemID="{44A4F72D-80E0-4364-836B-6B0C1A447B17}">
+<ds:datastoreItem xmlns:ds="http://schemas.openxmlformats.org/officeDocument/2006/customXml" ds:itemID="{17378D8E-43B3-40A1-A419-0B64802CB110}">
   <ds:schemaRefs>
-    <ds:schemaRef ds:uri="http://schemas.microsoft.com/sharepoint/v3/contenttype/forms"/>
+    <ds:schemaRef ds:uri="http://schemas.microsoft.com/office/2006/metadata/longProperties"/>
   </ds:schemaRefs>
 </ds:datastoreItem>
 </file>
</xml_diff>